<commit_message>
Xuất toàn bộ mẫu sang Word (Times New Roman 13, lề Normal, dữ liệu mẫu) và checklist sang Excel
- tools/md2docx: xử lý đầy đủ Markdown (tiêu đề, danh sách, checklist, ghi chú, sơ đồ), bảng AutoFit
  vừa khổ trang với cỡ chữ theo số cột, bảng ≥ 9 cột sang trang ngang; dữ liệu mẫu theo từng văn bản
- tools/md2docx/du-lieu-mau.json: hồ sơ mô phỏng của Công ty CP Giải pháp Công nghệ TURBO
  (chỉ tên công ty là thật; nhân sự, phòng ban, địa chỉ, số liệu đều giả lập)
- word/: 24 văn bản (Mẫu 01–08 NĐ 331, thuyết minh, đánh giá rủi ro, quyết định, quy chế, quy trình, kế hoạch)
- tools/md2xlsx + excel/: checklist cấp 1–5 có danh sách chọn và tổng hợp bằng công thức,
  ma trận yêu cầu, sổ đăng ký rủi ro, ma trận RACI

Co-Authored-By: Claude Opus 5.5 <noreply@anthropic.com>
Claude-Session: https://claude.ai/code/session_01EYfrLZFALxho7iwpK7bTVa
</commit_message>
<xml_diff>
--- a/word/02-ho-so-cap-do/mau-06-quyet-dinh-phe-duyet-cap-do.docx
+++ b/word/02-ho-so-cap-do/mau-06-quyet-dinh-phe-duyet-cap-do.docx
@@ -4,7 +4,7 @@
   <w:body>
     <w:tbl>
       <w:tblPr>
-        <w:tblW w:type="dxa" w:w="9354"/>
+        <w:tblW w:type="dxa" w:w="9025"/>
         <w:tblBorders>
           <w:top w:val="none" w:color="FFFFFF" w:sz="0"/>
           <w:left w:val="none" w:color="FFFFFF" w:sz="0"/>
@@ -16,13 +16,13 @@
         <w:tblLayout w:type="fixed"/>
       </w:tblPr>
       <w:tblGrid>
-        <w:gridCol w:w="3742"/>
-        <w:gridCol w:w="5612"/>
+        <w:gridCol w:w="3791"/>
+        <w:gridCol w:w="5234"/>
       </w:tblGrid>
       <w:tr>
         <w:tc>
           <w:tcPr>
-            <w:tcW w:type="dxa" w:w="3742"/>
+            <w:tcW w:type="dxa" w:w="3791"/>
             <w:tcBorders>
               <w:top w:val="none" w:color="FFFFFF" w:sz="0"/>
               <w:left w:val="none" w:color="FFFFFF" w:sz="0"/>
@@ -37,7 +37,7 @@
             </w:pPr>
             <w:r>
               <w:rPr>
-                <w:rFonts w:ascii="Calibri" w:cs="Calibri" w:eastAsia="Calibri" w:hAnsi="Calibri"/>
+                <w:rFonts w:ascii="Times New Roman" w:cs="Times New Roman" w:eastAsia="Times New Roman" w:hAnsi="Times New Roman"/>
                 <w:b/>
                 <w:bCs/>
                 <w:i w:val="false"/>
@@ -47,7 +47,7 @@
                 <w:szCs w:val="24"/>
                 <w:highlight w:val="yellow"/>
               </w:rPr>
-              <w:t xml:space="preserve">{{TEN_CHU_QUAN_HTTT}}</w:t>
+              <w:t xml:space="preserve">Công ty cổ phần Giải pháp Công nghệ TURBO</w:t>
             </w:r>
           </w:p>
           <w:p>
@@ -56,13 +56,13 @@
                 <w:top w:val="single" w:color="000000" w:sz="6" w:space="1"/>
               </w:pBdr>
               <w:spacing w:after="60" w:before="0"/>
-              <w:ind w:left="1216" w:right="1216"/>
+              <w:ind w:left="1327" w:right="1327"/>
             </w:pPr>
           </w:p>
         </w:tc>
         <w:tc>
           <w:tcPr>
-            <w:tcW w:type="dxa" w:w="5612"/>
+            <w:tcW w:type="dxa" w:w="5234"/>
             <w:tcBorders>
               <w:top w:val="none" w:color="FFFFFF" w:sz="0"/>
               <w:left w:val="none" w:color="FFFFFF" w:sz="0"/>
@@ -77,7 +77,7 @@
             </w:pPr>
             <w:r>
               <w:rPr>
-                <w:rFonts w:ascii="Calibri" w:cs="Calibri" w:eastAsia="Calibri" w:hAnsi="Calibri"/>
+                <w:rFonts w:ascii="Times New Roman" w:cs="Times New Roman" w:eastAsia="Times New Roman" w:hAnsi="Times New Roman"/>
                 <w:b/>
                 <w:bCs/>
                 <w:i w:val="false"/>
@@ -96,7 +96,7 @@
             </w:pPr>
             <w:r>
               <w:rPr>
-                <w:rFonts w:ascii="Calibri" w:cs="Calibri" w:eastAsia="Calibri" w:hAnsi="Calibri"/>
+                <w:rFonts w:ascii="Times New Roman" w:cs="Times New Roman" w:eastAsia="Times New Roman" w:hAnsi="Times New Roman"/>
                 <w:b/>
                 <w:bCs/>
                 <w:i w:val="false"/>
@@ -114,7 +114,7 @@
                 <w:top w:val="single" w:color="000000" w:sz="6" w:space="1"/>
               </w:pBdr>
               <w:spacing w:after="60" w:before="0"/>
-              <w:ind w:left="1066" w:right="1066"/>
+              <w:ind w:left="1047" w:right="1047"/>
             </w:pPr>
           </w:p>
         </w:tc>
@@ -122,7 +122,7 @@
       <w:tr>
         <w:tc>
           <w:tcPr>
-            <w:tcW w:type="dxa" w:w="3742"/>
+            <w:tcW w:type="dxa" w:w="3791"/>
             <w:tcBorders>
               <w:top w:val="none" w:color="FFFFFF" w:sz="0"/>
               <w:left w:val="none" w:color="FFFFFF" w:sz="0"/>
@@ -137,36 +137,36 @@
             </w:pPr>
             <w:r>
               <w:rPr>
-                <w:rFonts w:ascii="Calibri" w:cs="Calibri" w:eastAsia="Calibri" w:hAnsi="Calibri"/>
+                <w:rFonts w:ascii="Times New Roman" w:cs="Times New Roman" w:eastAsia="Times New Roman" w:hAnsi="Times New Roman"/>
                 <w:b w:val="false"/>
                 <w:bCs w:val="false"/>
                 <w:i w:val="false"/>
                 <w:iCs w:val="false"/>
                 <w:caps w:val="false"/>
-                <w:sz w:val="24"/>
-                <w:szCs w:val="24"/>
+                <w:sz w:val="26"/>
+                <w:szCs w:val="26"/>
               </w:rPr>
               <w:t xml:space="preserve">Số: </w:t>
             </w:r>
             <w:r>
               <w:rPr>
-                <w:rFonts w:ascii="Calibri" w:cs="Calibri" w:eastAsia="Calibri" w:hAnsi="Calibri"/>
+                <w:rFonts w:ascii="Times New Roman" w:cs="Times New Roman" w:eastAsia="Times New Roman" w:hAnsi="Times New Roman"/>
                 <w:b w:val="false"/>
                 <w:bCs w:val="false"/>
                 <w:i w:val="false"/>
                 <w:iCs w:val="false"/>
                 <w:caps w:val="false"/>
-                <w:sz w:val="24"/>
-                <w:szCs w:val="24"/>
+                <w:sz w:val="26"/>
+                <w:szCs w:val="26"/>
                 <w:highlight w:val="yellow"/>
               </w:rPr>
-              <w:t xml:space="preserve">{{SO_QUYET_DINH}}</w:t>
+              <w:t xml:space="preserve">30/2026/QĐ-TURBO</w:t>
             </w:r>
           </w:p>
         </w:tc>
         <w:tc>
           <w:tcPr>
-            <w:tcW w:type="dxa" w:w="5612"/>
+            <w:tcW w:type="dxa" w:w="5234"/>
             <w:tcBorders>
               <w:top w:val="none" w:color="FFFFFF" w:sz="0"/>
               <w:left w:val="none" w:color="FFFFFF" w:sz="0"/>
@@ -181,98 +181,98 @@
             </w:pPr>
             <w:r>
               <w:rPr>
-                <w:rFonts w:ascii="Calibri" w:cs="Calibri" w:eastAsia="Calibri" w:hAnsi="Calibri"/>
+                <w:rFonts w:ascii="Times New Roman" w:cs="Times New Roman" w:eastAsia="Times New Roman" w:hAnsi="Times New Roman"/>
                 <w:b w:val="false"/>
                 <w:bCs w:val="false"/>
-                <w:i/>
-                <w:iCs/>
+                <w:i w:val="false"/>
+                <w:iCs w:val="false"/>
                 <w:caps w:val="false"/>
-                <w:sz w:val="24"/>
-                <w:szCs w:val="24"/>
+                <w:sz w:val="26"/>
+                <w:szCs w:val="26"/>
                 <w:highlight w:val="yellow"/>
               </w:rPr>
-              <w:t xml:space="preserve">{{DIA_DANH}}</w:t>
-            </w:r>
-            <w:r>
-              <w:rPr>
-                <w:rFonts w:ascii="Calibri" w:cs="Calibri" w:eastAsia="Calibri" w:hAnsi="Calibri"/>
+              <w:t xml:space="preserve">TP. Hồ Chí Minh</w:t>
+            </w:r>
+            <w:r>
+              <w:rPr>
+                <w:rFonts w:ascii="Times New Roman" w:cs="Times New Roman" w:eastAsia="Times New Roman" w:hAnsi="Times New Roman"/>
                 <w:b w:val="false"/>
                 <w:bCs w:val="false"/>
-                <w:i/>
-                <w:iCs/>
+                <w:i w:val="false"/>
+                <w:iCs w:val="false"/>
                 <w:caps w:val="false"/>
-                <w:sz w:val="24"/>
-                <w:szCs w:val="24"/>
+                <w:sz w:val="26"/>
+                <w:szCs w:val="26"/>
               </w:rPr>
               <w:t xml:space="preserve">, ngày </w:t>
             </w:r>
             <w:r>
               <w:rPr>
-                <w:rFonts w:ascii="Calibri" w:cs="Calibri" w:eastAsia="Calibri" w:hAnsi="Calibri"/>
+                <w:rFonts w:ascii="Times New Roman" w:cs="Times New Roman" w:eastAsia="Times New Roman" w:hAnsi="Times New Roman"/>
                 <w:b w:val="false"/>
                 <w:bCs w:val="false"/>
-                <w:i/>
-                <w:iCs/>
+                <w:i w:val="false"/>
+                <w:iCs w:val="false"/>
                 <w:caps w:val="false"/>
-                <w:sz w:val="24"/>
-                <w:szCs w:val="24"/>
+                <w:sz w:val="26"/>
+                <w:szCs w:val="26"/>
                 <w:highlight w:val="yellow"/>
               </w:rPr>
-              <w:t xml:space="preserve">{{NGAY}}</w:t>
-            </w:r>
-            <w:r>
-              <w:rPr>
-                <w:rFonts w:ascii="Calibri" w:cs="Calibri" w:eastAsia="Calibri" w:hAnsi="Calibri"/>
+              <w:t xml:space="preserve">27</w:t>
+            </w:r>
+            <w:r>
+              <w:rPr>
+                <w:rFonts w:ascii="Times New Roman" w:cs="Times New Roman" w:eastAsia="Times New Roman" w:hAnsi="Times New Roman"/>
                 <w:b w:val="false"/>
                 <w:bCs w:val="false"/>
-                <w:i/>
-                <w:iCs/>
+                <w:i w:val="false"/>
+                <w:iCs w:val="false"/>
                 <w:caps w:val="false"/>
-                <w:sz w:val="24"/>
-                <w:szCs w:val="24"/>
+                <w:sz w:val="26"/>
+                <w:szCs w:val="26"/>
               </w:rPr>
               <w:t xml:space="preserve"> tháng </w:t>
             </w:r>
             <w:r>
               <w:rPr>
-                <w:rFonts w:ascii="Calibri" w:cs="Calibri" w:eastAsia="Calibri" w:hAnsi="Calibri"/>
+                <w:rFonts w:ascii="Times New Roman" w:cs="Times New Roman" w:eastAsia="Times New Roman" w:hAnsi="Times New Roman"/>
                 <w:b w:val="false"/>
                 <w:bCs w:val="false"/>
-                <w:i/>
-                <w:iCs/>
+                <w:i w:val="false"/>
+                <w:iCs w:val="false"/>
                 <w:caps w:val="false"/>
-                <w:sz w:val="24"/>
-                <w:szCs w:val="24"/>
+                <w:sz w:val="26"/>
+                <w:szCs w:val="26"/>
                 <w:highlight w:val="yellow"/>
               </w:rPr>
-              <w:t xml:space="preserve">{{THANG}}</w:t>
-            </w:r>
-            <w:r>
-              <w:rPr>
-                <w:rFonts w:ascii="Calibri" w:cs="Calibri" w:eastAsia="Calibri" w:hAnsi="Calibri"/>
+              <w:t xml:space="preserve">10</w:t>
+            </w:r>
+            <w:r>
+              <w:rPr>
+                <w:rFonts w:ascii="Times New Roman" w:cs="Times New Roman" w:eastAsia="Times New Roman" w:hAnsi="Times New Roman"/>
                 <w:b w:val="false"/>
                 <w:bCs w:val="false"/>
-                <w:i/>
-                <w:iCs/>
+                <w:i w:val="false"/>
+                <w:iCs w:val="false"/>
                 <w:caps w:val="false"/>
-                <w:sz w:val="24"/>
-                <w:szCs w:val="24"/>
+                <w:sz w:val="26"/>
+                <w:szCs w:val="26"/>
               </w:rPr>
               <w:t xml:space="preserve"> năm </w:t>
             </w:r>
             <w:r>
               <w:rPr>
-                <w:rFonts w:ascii="Calibri" w:cs="Calibri" w:eastAsia="Calibri" w:hAnsi="Calibri"/>
+                <w:rFonts w:ascii="Times New Roman" w:cs="Times New Roman" w:eastAsia="Times New Roman" w:hAnsi="Times New Roman"/>
                 <w:b w:val="false"/>
                 <w:bCs w:val="false"/>
-                <w:i/>
-                <w:iCs/>
+                <w:i w:val="false"/>
+                <w:iCs w:val="false"/>
                 <w:caps w:val="false"/>
-                <w:sz w:val="24"/>
-                <w:szCs w:val="24"/>
+                <w:sz w:val="26"/>
+                <w:szCs w:val="26"/>
                 <w:highlight w:val="yellow"/>
               </w:rPr>
-              <w:t xml:space="preserve">{{NAM}}</w:t>
+              <w:t xml:space="preserve">2026</w:t>
             </w:r>
           </w:p>
         </w:tc>
@@ -280,7 +280,7 @@
     </w:tbl>
     <w:p>
       <w:pPr>
-        <w:spacing w:after="0" w:before="0" w:line="276" w:lineRule="auto"/>
+        <w:spacing w:after="120" w:before="0" w:line="276" w:lineRule="auto"/>
         <w:jc w:val="both"/>
       </w:pPr>
     </w:p>
@@ -292,7 +292,7 @@
       </w:pPr>
       <w:r>
         <w:rPr>
-          <w:rFonts w:ascii="Calibri" w:cs="Calibri" w:eastAsia="Calibri" w:hAnsi="Calibri"/>
+          <w:rFonts w:ascii="Times New Roman" w:cs="Times New Roman" w:eastAsia="Times New Roman" w:hAnsi="Times New Roman"/>
           <w:b/>
           <w:bCs/>
           <w:i w:val="false"/>
@@ -311,7 +311,7 @@
       </w:pPr>
       <w:r>
         <w:rPr>
-          <w:rFonts w:ascii="Calibri" w:cs="Calibri" w:eastAsia="Calibri" w:hAnsi="Calibri"/>
+          <w:rFonts w:ascii="Times New Roman" w:cs="Times New Roman" w:eastAsia="Times New Roman" w:hAnsi="Times New Roman"/>
           <w:b/>
           <w:bCs/>
           <w:i w:val="false"/>
@@ -330,16 +330,16 @@
       </w:pPr>
       <w:r>
         <w:rPr>
-          <w:rFonts w:ascii="Calibri" w:cs="Calibri" w:eastAsia="Calibri" w:hAnsi="Calibri"/>
+          <w:rFonts w:ascii="Times New Roman" w:cs="Times New Roman" w:eastAsia="Times New Roman" w:hAnsi="Times New Roman"/>
           <w:b/>
           <w:bCs/>
           <w:i w:val="false"/>
           <w:iCs w:val="false"/>
-          <w:sz w:val="26"/>
-          <w:szCs w:val="26"/>
-          <w:highlight w:val="yellow"/>
-        </w:rPr>
-        <w:t xml:space="preserve">{{THU_TRUONG_CO_QUAN_TO_CHUC}}</w:t>
+          <w:sz w:val="28"/>
+          <w:szCs w:val="28"/>
+          <w:highlight w:val="yellow"/>
+        </w:rPr>
+        <w:t xml:space="preserve">TỔNG GIÁM ĐỐC CÔNG TY CỔ PHẦN GIẢI PHÁP CÔNG NGHỆ TURBO</w:t>
       </w:r>
     </w:p>
     <w:p>
@@ -350,7 +350,7 @@
       </w:pPr>
       <w:r>
         <w:rPr>
-          <w:rFonts w:ascii="Calibri" w:cs="Calibri" w:eastAsia="Calibri" w:hAnsi="Calibri"/>
+          <w:rFonts w:ascii="Times New Roman" w:cs="Times New Roman" w:eastAsia="Times New Roman" w:hAnsi="Times New Roman"/>
           <w:b w:val="false"/>
           <w:bCs w:val="false"/>
           <w:i w:val="false"/>
@@ -369,20 +369,20 @@
       </w:pPr>
       <w:r>
         <w:rPr>
-          <w:rFonts w:ascii="Calibri" w:cs="Calibri" w:eastAsia="Calibri" w:hAnsi="Calibri"/>
-          <w:b w:val="false"/>
-          <w:bCs w:val="false"/>
-          <w:i w:val="false"/>
-          <w:iCs w:val="false"/>
-          <w:sz w:val="26"/>
-          <w:szCs w:val="26"/>
-          <w:highlight w:val="yellow"/>
-        </w:rPr>
-        <w:t xml:space="preserve">{{CAN_CU_VAN_BAN_HUONG_DAN_VA_LIEN_QUAN}}</w:t>
-      </w:r>
-      <w:r>
-        <w:rPr>
-          <w:rFonts w:ascii="Calibri" w:cs="Calibri" w:eastAsia="Calibri" w:hAnsi="Calibri"/>
+          <w:rFonts w:ascii="Times New Roman" w:cs="Times New Roman" w:eastAsia="Times New Roman" w:hAnsi="Times New Roman"/>
+          <w:b w:val="false"/>
+          <w:bCs w:val="false"/>
+          <w:i w:val="false"/>
+          <w:iCs w:val="false"/>
+          <w:sz w:val="26"/>
+          <w:szCs w:val="26"/>
+          <w:highlight w:val="yellow"/>
+        </w:rPr>
+        <w:t xml:space="preserve">Căn cứ Nghị định số 331/2026/NĐ-CP ngày 19/8/2026 của Chính phủ về bảo vệ an ninh mạng đối với hệ thống thông tin; Căn cứ Điều lệ Công ty cổ phần Giải pháp Công nghệ TURBO</w:t>
+      </w:r>
+      <w:r>
+        <w:rPr>
+          <w:rFonts w:ascii="Times New Roman" w:cs="Times New Roman" w:eastAsia="Times New Roman" w:hAnsi="Times New Roman"/>
           <w:b w:val="false"/>
           <w:bCs w:val="false"/>
           <w:i w:val="false"/>
@@ -401,7 +401,7 @@
       </w:pPr>
       <w:r>
         <w:rPr>
-          <w:rFonts w:ascii="Calibri" w:cs="Calibri" w:eastAsia="Calibri" w:hAnsi="Calibri"/>
+          <w:rFonts w:ascii="Times New Roman" w:cs="Times New Roman" w:eastAsia="Times New Roman" w:hAnsi="Times New Roman"/>
           <w:b w:val="false"/>
           <w:bCs w:val="false"/>
           <w:i w:val="false"/>
@@ -413,20 +413,20 @@
       </w:r>
       <w:r>
         <w:rPr>
-          <w:rFonts w:ascii="Calibri" w:cs="Calibri" w:eastAsia="Calibri" w:hAnsi="Calibri"/>
-          <w:b w:val="false"/>
-          <w:bCs w:val="false"/>
-          <w:i w:val="false"/>
-          <w:iCs w:val="false"/>
-          <w:sz w:val="26"/>
-          <w:szCs w:val="26"/>
-          <w:highlight w:val="yellow"/>
-        </w:rPr>
-        <w:t xml:space="preserve">{{TEN_DON_VI_DE_NGHI}}</w:t>
-      </w:r>
-      <w:r>
-        <w:rPr>
-          <w:rFonts w:ascii="Calibri" w:cs="Calibri" w:eastAsia="Calibri" w:hAnsi="Calibri"/>
+          <w:rFonts w:ascii="Times New Roman" w:cs="Times New Roman" w:eastAsia="Times New Roman" w:hAnsi="Times New Roman"/>
+          <w:b w:val="false"/>
+          <w:bCs w:val="false"/>
+          <w:i w:val="false"/>
+          <w:iCs w:val="false"/>
+          <w:sz w:val="26"/>
+          <w:szCs w:val="26"/>
+          <w:highlight w:val="yellow"/>
+        </w:rPr>
+        <w:t xml:space="preserve">Phòng Vận hành hệ thống</w:t>
+      </w:r>
+      <w:r>
+        <w:rPr>
+          <w:rFonts w:ascii="Times New Roman" w:cs="Times New Roman" w:eastAsia="Times New Roman" w:hAnsi="Times New Roman"/>
           <w:b w:val="false"/>
           <w:bCs w:val="false"/>
           <w:i w:val="false"/>
@@ -445,13 +445,13 @@
       </w:pPr>
       <w:r>
         <w:rPr>
-          <w:rFonts w:ascii="Calibri" w:cs="Calibri" w:eastAsia="Calibri" w:hAnsi="Calibri"/>
+          <w:rFonts w:ascii="Times New Roman" w:cs="Times New Roman" w:eastAsia="Times New Roman" w:hAnsi="Times New Roman"/>
           <w:b/>
           <w:bCs/>
           <w:i w:val="false"/>
           <w:iCs w:val="false"/>
-          <w:sz w:val="26"/>
-          <w:szCs w:val="26"/>
+          <w:sz w:val="28"/>
+          <w:szCs w:val="28"/>
         </w:rPr>
         <w:t xml:space="preserve">QUYẾT ĐỊNH:</w:t>
       </w:r>
@@ -464,7 +464,7 @@
       </w:pPr>
       <w:r>
         <w:rPr>
-          <w:rFonts w:ascii="Calibri" w:cs="Calibri" w:eastAsia="Calibri" w:hAnsi="Calibri"/>
+          <w:rFonts w:ascii="Times New Roman" w:cs="Times New Roman" w:eastAsia="Times New Roman" w:hAnsi="Times New Roman"/>
           <w:b/>
           <w:bCs/>
           <w:i w:val="false"/>
@@ -476,7 +476,7 @@
       </w:r>
       <w:r>
         <w:rPr>
-          <w:rFonts w:ascii="Calibri" w:cs="Calibri" w:eastAsia="Calibri" w:hAnsi="Calibri"/>
+          <w:rFonts w:ascii="Times New Roman" w:cs="Times New Roman" w:eastAsia="Times New Roman" w:hAnsi="Times New Roman"/>
           <w:b w:val="false"/>
           <w:bCs w:val="false"/>
           <w:i w:val="false"/>
@@ -488,20 +488,20 @@
       </w:r>
       <w:r>
         <w:rPr>
-          <w:rFonts w:ascii="Calibri" w:cs="Calibri" w:eastAsia="Calibri" w:hAnsi="Calibri"/>
-          <w:b w:val="false"/>
-          <w:bCs w:val="false"/>
-          <w:i w:val="false"/>
-          <w:iCs w:val="false"/>
-          <w:sz w:val="26"/>
-          <w:szCs w:val="26"/>
-          <w:highlight w:val="yellow"/>
-        </w:rPr>
-        <w:t xml:space="preserve">{{TEN_HE_THONG}}</w:t>
-      </w:r>
-      <w:r>
-        <w:rPr>
-          <w:rFonts w:ascii="Calibri" w:cs="Calibri" w:eastAsia="Calibri" w:hAnsi="Calibri"/>
+          <w:rFonts w:ascii="Times New Roman" w:cs="Times New Roman" w:eastAsia="Times New Roman" w:hAnsi="Times New Roman"/>
+          <w:b w:val="false"/>
+          <w:bCs w:val="false"/>
+          <w:i w:val="false"/>
+          <w:iCs w:val="false"/>
+          <w:sz w:val="26"/>
+          <w:szCs w:val="26"/>
+          <w:highlight w:val="yellow"/>
+        </w:rPr>
+        <w:t xml:space="preserve">Hệ thống quản lý khách hàng trực tuyến (CRM Online)</w:t>
+      </w:r>
+      <w:r>
+        <w:rPr>
+          <w:rFonts w:ascii="Times New Roman" w:cs="Times New Roman" w:eastAsia="Times New Roman" w:hAnsi="Times New Roman"/>
           <w:b w:val="false"/>
           <w:bCs w:val="false"/>
           <w:i w:val="false"/>
@@ -510,6 +510,360 @@
           <w:szCs w:val="26"/>
         </w:rPr>
         <w:t xml:space="preserve"> cụ thể như sau:</w:t>
+      </w:r>
+    </w:p>
+    <w:p>
+      <w:pPr>
+        <w:spacing w:after="60" w:before="0" w:line="276" w:lineRule="auto"/>
+        <w:ind w:left="453" w:hanging="283"/>
+        <w:jc w:val="both"/>
+      </w:pPr>
+      <w:r>
+        <w:rPr>
+          <w:rFonts w:ascii="Times New Roman" w:cs="Times New Roman" w:eastAsia="Times New Roman" w:hAnsi="Times New Roman"/>
+          <w:b w:val="false"/>
+          <w:bCs w:val="false"/>
+          <w:i w:val="false"/>
+          <w:iCs w:val="false"/>
+          <w:sz w:val="26"/>
+          <w:szCs w:val="26"/>
+        </w:rPr>
+        <w:t xml:space="preserve">1. Thông tin chung</w:t>
+      </w:r>
+    </w:p>
+    <w:p>
+      <w:pPr>
+        <w:spacing w:after="120" w:before="0" w:line="276" w:lineRule="auto"/>
+        <w:ind w:firstLine="850"/>
+        <w:jc w:val="both"/>
+      </w:pPr>
+      <w:r>
+        <w:rPr>
+          <w:rFonts w:ascii="Times New Roman" w:cs="Times New Roman" w:eastAsia="Times New Roman" w:hAnsi="Times New Roman"/>
+          <w:b w:val="false"/>
+          <w:bCs w:val="false"/>
+          <w:i w:val="false"/>
+          <w:iCs w:val="false"/>
+          <w:sz w:val="26"/>
+          <w:szCs w:val="26"/>
+        </w:rPr>
+        <w:t xml:space="preserve">a) Tên hệ thống thông tin: </w:t>
+      </w:r>
+      <w:r>
+        <w:rPr>
+          <w:rFonts w:ascii="Times New Roman" w:cs="Times New Roman" w:eastAsia="Times New Roman" w:hAnsi="Times New Roman"/>
+          <w:b w:val="false"/>
+          <w:bCs w:val="false"/>
+          <w:i w:val="false"/>
+          <w:iCs w:val="false"/>
+          <w:sz w:val="26"/>
+          <w:szCs w:val="26"/>
+          <w:highlight w:val="yellow"/>
+        </w:rPr>
+        <w:t xml:space="preserve">Hệ thống quản lý khách hàng trực tuyến (CRM Online)</w:t>
+      </w:r>
+    </w:p>
+    <w:p>
+      <w:pPr>
+        <w:spacing w:after="120" w:before="0" w:line="276" w:lineRule="auto"/>
+        <w:ind w:firstLine="850"/>
+        <w:jc w:val="both"/>
+      </w:pPr>
+      <w:r>
+        <w:rPr>
+          <w:rFonts w:ascii="Times New Roman" w:cs="Times New Roman" w:eastAsia="Times New Roman" w:hAnsi="Times New Roman"/>
+          <w:b w:val="false"/>
+          <w:bCs w:val="false"/>
+          <w:i w:val="false"/>
+          <w:iCs w:val="false"/>
+          <w:sz w:val="26"/>
+          <w:szCs w:val="26"/>
+        </w:rPr>
+        <w:t xml:space="preserve">b) Đơn vị vận hành hệ thống thông tin: </w:t>
+      </w:r>
+      <w:r>
+        <w:rPr>
+          <w:rFonts w:ascii="Times New Roman" w:cs="Times New Roman" w:eastAsia="Times New Roman" w:hAnsi="Times New Roman"/>
+          <w:b w:val="false"/>
+          <w:bCs w:val="false"/>
+          <w:i w:val="false"/>
+          <w:iCs w:val="false"/>
+          <w:sz w:val="26"/>
+          <w:szCs w:val="26"/>
+          <w:highlight w:val="yellow"/>
+        </w:rPr>
+        <w:t xml:space="preserve">Phòng Vận hành hệ thống</w:t>
+      </w:r>
+    </w:p>
+    <w:p>
+      <w:pPr>
+        <w:spacing w:after="120" w:before="0" w:line="276" w:lineRule="auto"/>
+        <w:ind w:firstLine="850"/>
+        <w:jc w:val="both"/>
+      </w:pPr>
+      <w:r>
+        <w:rPr>
+          <w:rFonts w:ascii="Times New Roman" w:cs="Times New Roman" w:eastAsia="Times New Roman" w:hAnsi="Times New Roman"/>
+          <w:b w:val="false"/>
+          <w:bCs w:val="false"/>
+          <w:i w:val="false"/>
+          <w:iCs w:val="false"/>
+          <w:sz w:val="26"/>
+          <w:szCs w:val="26"/>
+        </w:rPr>
+        <w:t xml:space="preserve">c) Địa chỉ: </w:t>
+      </w:r>
+      <w:r>
+        <w:rPr>
+          <w:rFonts w:ascii="Times New Roman" w:cs="Times New Roman" w:eastAsia="Times New Roman" w:hAnsi="Times New Roman"/>
+          <w:b w:val="false"/>
+          <w:bCs w:val="false"/>
+          <w:i w:val="false"/>
+          <w:iCs w:val="false"/>
+          <w:sz w:val="26"/>
+          <w:szCs w:val="26"/>
+          <w:highlight w:val="yellow"/>
+        </w:rPr>
+        <w:t xml:space="preserve">Số 123 Đường Mẫu, Phường Mẫu, TP. Hồ Chí Minh</w:t>
+      </w:r>
+    </w:p>
+    <w:p>
+      <w:pPr>
+        <w:spacing w:after="60" w:before="0" w:line="276" w:lineRule="auto"/>
+        <w:ind w:left="453" w:hanging="283"/>
+        <w:jc w:val="both"/>
+      </w:pPr>
+      <w:r>
+        <w:rPr>
+          <w:rFonts w:ascii="Times New Roman" w:cs="Times New Roman" w:eastAsia="Times New Roman" w:hAnsi="Times New Roman"/>
+          <w:b w:val="false"/>
+          <w:bCs w:val="false"/>
+          <w:i w:val="false"/>
+          <w:iCs w:val="false"/>
+          <w:sz w:val="26"/>
+          <w:szCs w:val="26"/>
+        </w:rPr>
+        <w:t xml:space="preserve">2. Cấp độ hệ thống thông tin: </w:t>
+      </w:r>
+      <w:r>
+        <w:rPr>
+          <w:rFonts w:ascii="Times New Roman" w:cs="Times New Roman" w:eastAsia="Times New Roman" w:hAnsi="Times New Roman"/>
+          <w:b w:val="false"/>
+          <w:bCs w:val="false"/>
+          <w:i w:val="false"/>
+          <w:iCs w:val="false"/>
+          <w:sz w:val="26"/>
+          <w:szCs w:val="26"/>
+          <w:highlight w:val="yellow"/>
+        </w:rPr>
+        <w:t xml:space="preserve">3</w:t>
+      </w:r>
+    </w:p>
+    <w:p>
+      <w:pPr>
+        <w:spacing w:after="60" w:before="0" w:line="276" w:lineRule="auto"/>
+        <w:ind w:left="453" w:hanging="283"/>
+        <w:jc w:val="both"/>
+      </w:pPr>
+      <w:r>
+        <w:rPr>
+          <w:rFonts w:ascii="Times New Roman" w:cs="Times New Roman" w:eastAsia="Times New Roman" w:hAnsi="Times New Roman"/>
+          <w:b w:val="false"/>
+          <w:bCs w:val="false"/>
+          <w:i w:val="false"/>
+          <w:iCs w:val="false"/>
+          <w:sz w:val="26"/>
+          <w:szCs w:val="26"/>
+        </w:rPr>
+        <w:t xml:space="preserve">3. Phương án bảo đảm an ninh mạng:</w:t>
+      </w:r>
+    </w:p>
+    <w:p>
+      <w:pPr>
+        <w:spacing w:after="120" w:before="0" w:line="276" w:lineRule="auto"/>
+        <w:ind w:firstLine="850"/>
+        <w:jc w:val="both"/>
+      </w:pPr>
+      <w:r>
+        <w:rPr>
+          <w:rFonts w:ascii="Times New Roman" w:cs="Times New Roman" w:eastAsia="Times New Roman" w:hAnsi="Times New Roman"/>
+          <w:b w:val="false"/>
+          <w:bCs w:val="false"/>
+          <w:i w:val="false"/>
+          <w:iCs w:val="false"/>
+          <w:sz w:val="26"/>
+          <w:szCs w:val="26"/>
+        </w:rPr>
+        <w:t xml:space="preserve">a) Phương án bảo đảm an ninh mạng trong thiết kế hệ thống thông tin tương ứng với cấp độ </w:t>
+      </w:r>
+      <w:r>
+        <w:rPr>
+          <w:rFonts w:ascii="Times New Roman" w:cs="Times New Roman" w:eastAsia="Times New Roman" w:hAnsi="Times New Roman"/>
+          <w:b w:val="false"/>
+          <w:bCs w:val="false"/>
+          <w:i w:val="false"/>
+          <w:iCs w:val="false"/>
+          <w:sz w:val="26"/>
+          <w:szCs w:val="26"/>
+          <w:highlight w:val="yellow"/>
+        </w:rPr>
+        <w:t xml:space="preserve">3</w:t>
+      </w:r>
+      <w:r>
+        <w:rPr>
+          <w:rFonts w:ascii="Times New Roman" w:cs="Times New Roman" w:eastAsia="Times New Roman" w:hAnsi="Times New Roman"/>
+          <w:b w:val="false"/>
+          <w:bCs w:val="false"/>
+          <w:i w:val="false"/>
+          <w:iCs w:val="false"/>
+          <w:sz w:val="26"/>
+          <w:szCs w:val="26"/>
+        </w:rPr>
+        <w:t xml:space="preserve"> là phù hợp với tiêu chuẩn quốc gia </w:t>
+      </w:r>
+      <w:r>
+        <w:rPr>
+          <w:rFonts w:ascii="Times New Roman" w:cs="Times New Roman" w:eastAsia="Times New Roman" w:hAnsi="Times New Roman"/>
+          <w:b w:val="false"/>
+          <w:bCs w:val="false"/>
+          <w:i w:val="false"/>
+          <w:iCs w:val="false"/>
+          <w:sz w:val="26"/>
+          <w:szCs w:val="26"/>
+          <w:highlight w:val="yellow"/>
+        </w:rPr>
+        <w:t xml:space="preserve">TCVN 14423:2026 An ninh mạng – Hệ thống thông tin – Yêu cầu cơ bản (mục 5 – cấp độ 3)</w:t>
+      </w:r>
+      <w:r>
+        <w:rPr>
+          <w:rFonts w:ascii="Times New Roman" w:cs="Times New Roman" w:eastAsia="Times New Roman" w:hAnsi="Times New Roman"/>
+          <w:b w:val="false"/>
+          <w:bCs w:val="false"/>
+          <w:i w:val="false"/>
+          <w:iCs w:val="false"/>
+          <w:sz w:val="26"/>
+          <w:szCs w:val="26"/>
+        </w:rPr>
+        <w:t xml:space="preserve">, quy chuẩn kỹ thuật quốc gia </w:t>
+      </w:r>
+      <w:r>
+        <w:rPr>
+          <w:rFonts w:ascii="Times New Roman" w:cs="Times New Roman" w:eastAsia="Times New Roman" w:hAnsi="Times New Roman"/>
+          <w:b w:val="false"/>
+          <w:bCs w:val="false"/>
+          <w:i w:val="false"/>
+          <w:iCs w:val="false"/>
+          <w:sz w:val="26"/>
+          <w:szCs w:val="26"/>
+          <w:highlight w:val="yellow"/>
+        </w:rPr>
+        <w:t xml:space="preserve">(chưa có quy chuẩn kỹ thuật quốc gia tương ứng)</w:t>
+      </w:r>
+      <w:r>
+        <w:rPr>
+          <w:rFonts w:ascii="Times New Roman" w:cs="Times New Roman" w:eastAsia="Times New Roman" w:hAnsi="Times New Roman"/>
+          <w:b w:val="false"/>
+          <w:bCs w:val="false"/>
+          <w:i w:val="false"/>
+          <w:iCs w:val="false"/>
+          <w:sz w:val="26"/>
+          <w:szCs w:val="26"/>
+        </w:rPr>
+        <w:t xml:space="preserve"> về bảo đảm an ninh mạng theo cấp độ.</w:t>
+      </w:r>
+    </w:p>
+    <w:p>
+      <w:pPr>
+        <w:spacing w:after="120" w:before="0" w:line="276" w:lineRule="auto"/>
+        <w:ind w:firstLine="850"/>
+        <w:jc w:val="both"/>
+      </w:pPr>
+      <w:r>
+        <w:rPr>
+          <w:rFonts w:ascii="Times New Roman" w:cs="Times New Roman" w:eastAsia="Times New Roman" w:hAnsi="Times New Roman"/>
+          <w:b w:val="false"/>
+          <w:bCs w:val="false"/>
+          <w:i w:val="false"/>
+          <w:iCs w:val="false"/>
+          <w:sz w:val="26"/>
+          <w:szCs w:val="26"/>
+        </w:rPr>
+        <w:t xml:space="preserve">b) Phương án bảo đảm an ninh mạng trong quá trình vận hành hệ thống tương ứng với cấp độ </w:t>
+      </w:r>
+      <w:r>
+        <w:rPr>
+          <w:rFonts w:ascii="Times New Roman" w:cs="Times New Roman" w:eastAsia="Times New Roman" w:hAnsi="Times New Roman"/>
+          <w:b w:val="false"/>
+          <w:bCs w:val="false"/>
+          <w:i w:val="false"/>
+          <w:iCs w:val="false"/>
+          <w:sz w:val="26"/>
+          <w:szCs w:val="26"/>
+          <w:highlight w:val="yellow"/>
+        </w:rPr>
+        <w:t xml:space="preserve">3</w:t>
+      </w:r>
+      <w:r>
+        <w:rPr>
+          <w:rFonts w:ascii="Times New Roman" w:cs="Times New Roman" w:eastAsia="Times New Roman" w:hAnsi="Times New Roman"/>
+          <w:b w:val="false"/>
+          <w:bCs w:val="false"/>
+          <w:i w:val="false"/>
+          <w:iCs w:val="false"/>
+          <w:sz w:val="26"/>
+          <w:szCs w:val="26"/>
+        </w:rPr>
+        <w:t xml:space="preserve"> là phù hợp với tiêu chuẩn quốc gia </w:t>
+      </w:r>
+      <w:r>
+        <w:rPr>
+          <w:rFonts w:ascii="Times New Roman" w:cs="Times New Roman" w:eastAsia="Times New Roman" w:hAnsi="Times New Roman"/>
+          <w:b w:val="false"/>
+          <w:bCs w:val="false"/>
+          <w:i w:val="false"/>
+          <w:iCs w:val="false"/>
+          <w:sz w:val="26"/>
+          <w:szCs w:val="26"/>
+          <w:highlight w:val="yellow"/>
+        </w:rPr>
+        <w:t xml:space="preserve">TCVN 14423:2026 An ninh mạng – Hệ thống thông tin – Yêu cầu cơ bản (mục 5 – cấp độ 3)</w:t>
+      </w:r>
+      <w:r>
+        <w:rPr>
+          <w:rFonts w:ascii="Times New Roman" w:cs="Times New Roman" w:eastAsia="Times New Roman" w:hAnsi="Times New Roman"/>
+          <w:b w:val="false"/>
+          <w:bCs w:val="false"/>
+          <w:i w:val="false"/>
+          <w:iCs w:val="false"/>
+          <w:sz w:val="26"/>
+          <w:szCs w:val="26"/>
+        </w:rPr>
+        <w:t xml:space="preserve">, quy chuẩn kỹ thuật quốc gia </w:t>
+      </w:r>
+      <w:r>
+        <w:rPr>
+          <w:rFonts w:ascii="Times New Roman" w:cs="Times New Roman" w:eastAsia="Times New Roman" w:hAnsi="Times New Roman"/>
+          <w:b w:val="false"/>
+          <w:bCs w:val="false"/>
+          <w:i w:val="false"/>
+          <w:iCs w:val="false"/>
+          <w:sz w:val="26"/>
+          <w:szCs w:val="26"/>
+          <w:highlight w:val="yellow"/>
+        </w:rPr>
+        <w:t xml:space="preserve">(chưa có quy chuẩn kỹ thuật quốc gia tương ứng)</w:t>
+      </w:r>
+      <w:r>
+        <w:rPr>
+          <w:rFonts w:ascii="Times New Roman" w:cs="Times New Roman" w:eastAsia="Times New Roman" w:hAnsi="Times New Roman"/>
+          <w:b w:val="false"/>
+          <w:bCs w:val="false"/>
+          <w:i w:val="false"/>
+          <w:iCs w:val="false"/>
+          <w:sz w:val="26"/>
+          <w:szCs w:val="26"/>
+        </w:rPr>
+        <w:t xml:space="preserve"> về bảo đảm an ninh mạng theo cấp độ.</w:t>
       </w:r>
     </w:p>
     <w:p>
@@ -520,15 +874,71 @@
       </w:pPr>
       <w:r>
         <w:rPr>
-          <w:rFonts w:ascii="Calibri" w:cs="Calibri" w:eastAsia="Calibri" w:hAnsi="Calibri"/>
-          <w:b w:val="false"/>
-          <w:bCs w:val="false"/>
-          <w:i w:val="false"/>
-          <w:iCs w:val="false"/>
-          <w:sz w:val="26"/>
-          <w:szCs w:val="26"/>
-        </w:rPr>
-        <w:t xml:space="preserve">1. Thông tin chung</w:t>
+          <w:rFonts w:ascii="Times New Roman" w:cs="Times New Roman" w:eastAsia="Times New Roman" w:hAnsi="Times New Roman"/>
+          <w:b/>
+          <w:bCs/>
+          <w:i w:val="false"/>
+          <w:iCs w:val="false"/>
+          <w:sz w:val="26"/>
+          <w:szCs w:val="26"/>
+        </w:rPr>
+        <w:t xml:space="preserve">Điều 2.</w:t>
+      </w:r>
+      <w:r>
+        <w:rPr>
+          <w:rFonts w:ascii="Times New Roman" w:cs="Times New Roman" w:eastAsia="Times New Roman" w:hAnsi="Times New Roman"/>
+          <w:b w:val="false"/>
+          <w:bCs w:val="false"/>
+          <w:i w:val="false"/>
+          <w:iCs w:val="false"/>
+          <w:sz w:val="26"/>
+          <w:szCs w:val="26"/>
+        </w:rPr>
+        <w:t xml:space="preserve"> Tổ chức thực hiện</w:t>
+      </w:r>
+    </w:p>
+    <w:p>
+      <w:pPr>
+        <w:spacing w:after="60" w:before="0" w:line="276" w:lineRule="auto"/>
+        <w:ind w:left="453" w:hanging="283"/>
+        <w:jc w:val="both"/>
+      </w:pPr>
+      <w:r>
+        <w:rPr>
+          <w:rFonts w:ascii="Times New Roman" w:cs="Times New Roman" w:eastAsia="Times New Roman" w:hAnsi="Times New Roman"/>
+          <w:b w:val="false"/>
+          <w:bCs w:val="false"/>
+          <w:i w:val="false"/>
+          <w:iCs w:val="false"/>
+          <w:sz w:val="26"/>
+          <w:szCs w:val="26"/>
+        </w:rPr>
+        <w:t xml:space="preserve">1. Cơ quan </w:t>
+      </w:r>
+      <w:r>
+        <w:rPr>
+          <w:rFonts w:ascii="Times New Roman" w:cs="Times New Roman" w:eastAsia="Times New Roman" w:hAnsi="Times New Roman"/>
+          <w:b w:val="false"/>
+          <w:bCs w:val="false"/>
+          <w:i w:val="false"/>
+          <w:iCs w:val="false"/>
+          <w:sz w:val="26"/>
+          <w:szCs w:val="26"/>
+          <w:highlight w:val="yellow"/>
+        </w:rPr>
+        <w:t xml:space="preserve">Phòng Vận hành hệ thống</w:t>
+      </w:r>
+      <w:r>
+        <w:rPr>
+          <w:rFonts w:ascii="Times New Roman" w:cs="Times New Roman" w:eastAsia="Times New Roman" w:hAnsi="Times New Roman"/>
+          <w:b w:val="false"/>
+          <w:bCs w:val="false"/>
+          <w:i w:val="false"/>
+          <w:iCs w:val="false"/>
+          <w:sz w:val="26"/>
+          <w:szCs w:val="26"/>
+        </w:rPr>
+        <w:t xml:space="preserve"> chịu trách nhiệm:</w:t>
       </w:r>
     </w:p>
     <w:p>
@@ -539,28 +949,15 @@
       </w:pPr>
       <w:r>
         <w:rPr>
-          <w:rFonts w:ascii="Calibri" w:cs="Calibri" w:eastAsia="Calibri" w:hAnsi="Calibri"/>
-          <w:b w:val="false"/>
-          <w:bCs w:val="false"/>
-          <w:i w:val="false"/>
-          <w:iCs w:val="false"/>
-          <w:sz w:val="26"/>
-          <w:szCs w:val="26"/>
-        </w:rPr>
-        <w:t xml:space="preserve">a) Tên hệ thống thông tin: </w:t>
-      </w:r>
-      <w:r>
-        <w:rPr>
-          <w:rFonts w:ascii="Calibri" w:cs="Calibri" w:eastAsia="Calibri" w:hAnsi="Calibri"/>
-          <w:b w:val="false"/>
-          <w:bCs w:val="false"/>
-          <w:i w:val="false"/>
-          <w:iCs w:val="false"/>
-          <w:sz w:val="26"/>
-          <w:szCs w:val="26"/>
-          <w:highlight w:val="yellow"/>
-        </w:rPr>
-        <w:t xml:space="preserve">{{TEN_HE_THONG}}</w:t>
+          <w:rFonts w:ascii="Times New Roman" w:cs="Times New Roman" w:eastAsia="Times New Roman" w:hAnsi="Times New Roman"/>
+          <w:b w:val="false"/>
+          <w:bCs w:val="false"/>
+          <w:i w:val="false"/>
+          <w:iCs w:val="false"/>
+          <w:sz w:val="26"/>
+          <w:szCs w:val="26"/>
+        </w:rPr>
+        <w:t xml:space="preserve">a) Thực hiện trách nhiệm bảo đảm an ninh mạng hệ thống thông tin mình quản lý theo các quy định tại Điều 33 Nghị định này.</w:t>
       </w:r>
     </w:p>
     <w:p>
@@ -571,60 +968,60 @@
       </w:pPr>
       <w:r>
         <w:rPr>
-          <w:rFonts w:ascii="Calibri" w:cs="Calibri" w:eastAsia="Calibri" w:hAnsi="Calibri"/>
-          <w:b w:val="false"/>
-          <w:bCs w:val="false"/>
-          <w:i w:val="false"/>
-          <w:iCs w:val="false"/>
-          <w:sz w:val="26"/>
-          <w:szCs w:val="26"/>
-        </w:rPr>
-        <w:t xml:space="preserve">b) Đơn vị vận hành hệ thống thông tin: </w:t>
-      </w:r>
-      <w:r>
-        <w:rPr>
-          <w:rFonts w:ascii="Calibri" w:cs="Calibri" w:eastAsia="Calibri" w:hAnsi="Calibri"/>
-          <w:b w:val="false"/>
-          <w:bCs w:val="false"/>
-          <w:i w:val="false"/>
-          <w:iCs w:val="false"/>
-          <w:sz w:val="26"/>
-          <w:szCs w:val="26"/>
-          <w:highlight w:val="yellow"/>
-        </w:rPr>
-        <w:t xml:space="preserve">{{TEN_DON_VI_VAN_HANH}}</w:t>
-      </w:r>
-    </w:p>
-    <w:p>
-      <w:pPr>
-        <w:spacing w:after="120" w:before="0" w:line="276" w:lineRule="auto"/>
-        <w:ind w:firstLine="850"/>
-        <w:jc w:val="both"/>
-      </w:pPr>
-      <w:r>
-        <w:rPr>
-          <w:rFonts w:ascii="Calibri" w:cs="Calibri" w:eastAsia="Calibri" w:hAnsi="Calibri"/>
-          <w:b w:val="false"/>
-          <w:bCs w:val="false"/>
-          <w:i w:val="false"/>
-          <w:iCs w:val="false"/>
-          <w:sz w:val="26"/>
-          <w:szCs w:val="26"/>
-        </w:rPr>
-        <w:t xml:space="preserve">c) Địa chỉ: </w:t>
-      </w:r>
-      <w:r>
-        <w:rPr>
-          <w:rFonts w:ascii="Calibri" w:cs="Calibri" w:eastAsia="Calibri" w:hAnsi="Calibri"/>
-          <w:b w:val="false"/>
-          <w:bCs w:val="false"/>
-          <w:i w:val="false"/>
-          <w:iCs w:val="false"/>
-          <w:sz w:val="26"/>
-          <w:szCs w:val="26"/>
-          <w:highlight w:val="yellow"/>
-        </w:rPr>
-        <w:t xml:space="preserve">{{DIA_CHI}}</w:t>
+          <w:rFonts w:ascii="Times New Roman" w:cs="Times New Roman" w:eastAsia="Times New Roman" w:hAnsi="Times New Roman"/>
+          <w:b w:val="false"/>
+          <w:bCs w:val="false"/>
+          <w:i w:val="false"/>
+          <w:iCs w:val="false"/>
+          <w:sz w:val="26"/>
+          <w:szCs w:val="26"/>
+        </w:rPr>
+        <w:t xml:space="preserve">b) Các nội dung khác (nếu có). </w:t>
+      </w:r>
+      <w:r>
+        <w:rPr>
+          <w:rFonts w:ascii="Times New Roman" w:cs="Times New Roman" w:eastAsia="Times New Roman" w:hAnsi="Times New Roman"/>
+          <w:b w:val="false"/>
+          <w:bCs w:val="false"/>
+          <w:i w:val="false"/>
+          <w:iCs w:val="false"/>
+          <w:sz w:val="26"/>
+          <w:szCs w:val="26"/>
+          <w:highlight w:val="yellow"/>
+        </w:rPr>
+        <w:t xml:space="preserve">Không có.</w:t>
+      </w:r>
+    </w:p>
+    <w:p>
+      <w:pPr>
+        <w:spacing w:after="60" w:before="0" w:line="276" w:lineRule="auto"/>
+        <w:ind w:left="453" w:hanging="283"/>
+        <w:jc w:val="both"/>
+      </w:pPr>
+      <w:r>
+        <w:rPr>
+          <w:rFonts w:ascii="Times New Roman" w:cs="Times New Roman" w:eastAsia="Times New Roman" w:hAnsi="Times New Roman"/>
+          <w:b w:val="false"/>
+          <w:bCs w:val="false"/>
+          <w:i w:val="false"/>
+          <w:iCs w:val="false"/>
+          <w:sz w:val="26"/>
+          <w:szCs w:val="26"/>
+        </w:rPr>
+        <w:t xml:space="preserve">2. Trách nhiệm của các cơ quan liên quan khác (nếu có). </w:t>
+      </w:r>
+      <w:r>
+        <w:rPr>
+          <w:rFonts w:ascii="Times New Roman" w:cs="Times New Roman" w:eastAsia="Times New Roman" w:hAnsi="Times New Roman"/>
+          <w:b w:val="false"/>
+          <w:bCs w:val="false"/>
+          <w:i w:val="false"/>
+          <w:iCs w:val="false"/>
+          <w:sz w:val="26"/>
+          <w:szCs w:val="26"/>
+          <w:highlight w:val="yellow"/>
+        </w:rPr>
+        <w:t xml:space="preserve">Không có.</w:t>
       </w:r>
     </w:p>
     <w:p>
@@ -635,246 +1032,7 @@
       </w:pPr>
       <w:r>
         <w:rPr>
-          <w:rFonts w:ascii="Calibri" w:cs="Calibri" w:eastAsia="Calibri" w:hAnsi="Calibri"/>
-          <w:b w:val="false"/>
-          <w:bCs w:val="false"/>
-          <w:i w:val="false"/>
-          <w:iCs w:val="false"/>
-          <w:sz w:val="26"/>
-          <w:szCs w:val="26"/>
-        </w:rPr>
-        <w:t xml:space="preserve">2. Cấp độ hệ thống thông tin: </w:t>
-      </w:r>
-      <w:r>
-        <w:rPr>
-          <w:rFonts w:ascii="Calibri" w:cs="Calibri" w:eastAsia="Calibri" w:hAnsi="Calibri"/>
-          <w:b w:val="false"/>
-          <w:bCs w:val="false"/>
-          <w:i w:val="false"/>
-          <w:iCs w:val="false"/>
-          <w:sz w:val="26"/>
-          <w:szCs w:val="26"/>
-          <w:highlight w:val="yellow"/>
-        </w:rPr>
-        <w:t xml:space="preserve">{{CAP_DO}}</w:t>
-      </w:r>
-    </w:p>
-    <w:p>
-      <w:pPr>
-        <w:spacing w:after="120" w:before="0" w:line="276" w:lineRule="auto"/>
-        <w:ind w:firstLine="566"/>
-        <w:jc w:val="both"/>
-      </w:pPr>
-      <w:r>
-        <w:rPr>
-          <w:rFonts w:ascii="Calibri" w:cs="Calibri" w:eastAsia="Calibri" w:hAnsi="Calibri"/>
-          <w:b w:val="false"/>
-          <w:bCs w:val="false"/>
-          <w:i w:val="false"/>
-          <w:iCs w:val="false"/>
-          <w:sz w:val="26"/>
-          <w:szCs w:val="26"/>
-        </w:rPr>
-        <w:t xml:space="preserve">3. Phương án bảo đảm an ninh mạng:</w:t>
-      </w:r>
-    </w:p>
-    <w:p>
-      <w:pPr>
-        <w:spacing w:after="120" w:before="0" w:line="276" w:lineRule="auto"/>
-        <w:ind w:firstLine="850"/>
-        <w:jc w:val="both"/>
-      </w:pPr>
-      <w:r>
-        <w:rPr>
-          <w:rFonts w:ascii="Calibri" w:cs="Calibri" w:eastAsia="Calibri" w:hAnsi="Calibri"/>
-          <w:b w:val="false"/>
-          <w:bCs w:val="false"/>
-          <w:i w:val="false"/>
-          <w:iCs w:val="false"/>
-          <w:sz w:val="26"/>
-          <w:szCs w:val="26"/>
-        </w:rPr>
-        <w:t xml:space="preserve">a) Phương án bảo đảm an ninh mạng trong thiết kế hệ thống thông tin tương ứng với cấp độ </w:t>
-      </w:r>
-      <w:r>
-        <w:rPr>
-          <w:rFonts w:ascii="Calibri" w:cs="Calibri" w:eastAsia="Calibri" w:hAnsi="Calibri"/>
-          <w:b w:val="false"/>
-          <w:bCs w:val="false"/>
-          <w:i w:val="false"/>
-          <w:iCs w:val="false"/>
-          <w:sz w:val="26"/>
-          <w:szCs w:val="26"/>
-          <w:highlight w:val="yellow"/>
-        </w:rPr>
-        <w:t xml:space="preserve">{{CAP_DO}}</w:t>
-      </w:r>
-      <w:r>
-        <w:rPr>
-          <w:rFonts w:ascii="Calibri" w:cs="Calibri" w:eastAsia="Calibri" w:hAnsi="Calibri"/>
-          <w:b w:val="false"/>
-          <w:bCs w:val="false"/>
-          <w:i w:val="false"/>
-          <w:iCs w:val="false"/>
-          <w:sz w:val="26"/>
-          <w:szCs w:val="26"/>
-        </w:rPr>
-        <w:t xml:space="preserve"> là phù hợp với tiêu chuẩn quốc gia </w:t>
-      </w:r>
-      <w:r>
-        <w:rPr>
-          <w:rFonts w:ascii="Calibri" w:cs="Calibri" w:eastAsia="Calibri" w:hAnsi="Calibri"/>
-          <w:b w:val="false"/>
-          <w:bCs w:val="false"/>
-          <w:i w:val="false"/>
-          <w:iCs w:val="false"/>
-          <w:sz w:val="26"/>
-          <w:szCs w:val="26"/>
-          <w:highlight w:val="yellow"/>
-        </w:rPr>
-        <w:t xml:space="preserve">{{TEN_TIEU_CHUAN}}</w:t>
-      </w:r>
-      <w:r>
-        <w:rPr>
-          <w:rFonts w:ascii="Calibri" w:cs="Calibri" w:eastAsia="Calibri" w:hAnsi="Calibri"/>
-          <w:b w:val="false"/>
-          <w:bCs w:val="false"/>
-          <w:i w:val="false"/>
-          <w:iCs w:val="false"/>
-          <w:sz w:val="26"/>
-          <w:szCs w:val="26"/>
-        </w:rPr>
-        <w:t xml:space="preserve">, quy chuẩn kỹ thuật quốc gia </w:t>
-      </w:r>
-      <w:r>
-        <w:rPr>
-          <w:rFonts w:ascii="Calibri" w:cs="Calibri" w:eastAsia="Calibri" w:hAnsi="Calibri"/>
-          <w:b w:val="false"/>
-          <w:bCs w:val="false"/>
-          <w:i w:val="false"/>
-          <w:iCs w:val="false"/>
-          <w:sz w:val="26"/>
-          <w:szCs w:val="26"/>
-          <w:highlight w:val="yellow"/>
-        </w:rPr>
-        <w:t xml:space="preserve">{{TEN_QUY_CHUAN}}</w:t>
-      </w:r>
-      <w:r>
-        <w:rPr>
-          <w:rFonts w:ascii="Calibri" w:cs="Calibri" w:eastAsia="Calibri" w:hAnsi="Calibri"/>
-          <w:b w:val="false"/>
-          <w:bCs w:val="false"/>
-          <w:i w:val="false"/>
-          <w:iCs w:val="false"/>
-          <w:sz w:val="26"/>
-          <w:szCs w:val="26"/>
-        </w:rPr>
-        <w:t xml:space="preserve"> về bảo đảm an ninh mạng theo cấp độ.</w:t>
-      </w:r>
-    </w:p>
-    <w:p>
-      <w:pPr>
-        <w:spacing w:after="120" w:before="0" w:line="276" w:lineRule="auto"/>
-        <w:ind w:firstLine="850"/>
-        <w:jc w:val="both"/>
-      </w:pPr>
-      <w:r>
-        <w:rPr>
-          <w:rFonts w:ascii="Calibri" w:cs="Calibri" w:eastAsia="Calibri" w:hAnsi="Calibri"/>
-          <w:b w:val="false"/>
-          <w:bCs w:val="false"/>
-          <w:i w:val="false"/>
-          <w:iCs w:val="false"/>
-          <w:sz w:val="26"/>
-          <w:szCs w:val="26"/>
-        </w:rPr>
-        <w:t xml:space="preserve">b) Phương án bảo đảm an ninh mạng trong quá trình vận hành hệ thống tương ứng với cấp độ </w:t>
-      </w:r>
-      <w:r>
-        <w:rPr>
-          <w:rFonts w:ascii="Calibri" w:cs="Calibri" w:eastAsia="Calibri" w:hAnsi="Calibri"/>
-          <w:b w:val="false"/>
-          <w:bCs w:val="false"/>
-          <w:i w:val="false"/>
-          <w:iCs w:val="false"/>
-          <w:sz w:val="26"/>
-          <w:szCs w:val="26"/>
-          <w:highlight w:val="yellow"/>
-        </w:rPr>
-        <w:t xml:space="preserve">{{CAP_DO}}</w:t>
-      </w:r>
-      <w:r>
-        <w:rPr>
-          <w:rFonts w:ascii="Calibri" w:cs="Calibri" w:eastAsia="Calibri" w:hAnsi="Calibri"/>
-          <w:b w:val="false"/>
-          <w:bCs w:val="false"/>
-          <w:i w:val="false"/>
-          <w:iCs w:val="false"/>
-          <w:sz w:val="26"/>
-          <w:szCs w:val="26"/>
-        </w:rPr>
-        <w:t xml:space="preserve"> là phù hợp với tiêu chuẩn quốc gia </w:t>
-      </w:r>
-      <w:r>
-        <w:rPr>
-          <w:rFonts w:ascii="Calibri" w:cs="Calibri" w:eastAsia="Calibri" w:hAnsi="Calibri"/>
-          <w:b w:val="false"/>
-          <w:bCs w:val="false"/>
-          <w:i w:val="false"/>
-          <w:iCs w:val="false"/>
-          <w:sz w:val="26"/>
-          <w:szCs w:val="26"/>
-          <w:highlight w:val="yellow"/>
-        </w:rPr>
-        <w:t xml:space="preserve">{{TEN_TIEU_CHUAN}}</w:t>
-      </w:r>
-      <w:r>
-        <w:rPr>
-          <w:rFonts w:ascii="Calibri" w:cs="Calibri" w:eastAsia="Calibri" w:hAnsi="Calibri"/>
-          <w:b w:val="false"/>
-          <w:bCs w:val="false"/>
-          <w:i w:val="false"/>
-          <w:iCs w:val="false"/>
-          <w:sz w:val="26"/>
-          <w:szCs w:val="26"/>
-        </w:rPr>
-        <w:t xml:space="preserve">, quy chuẩn kỹ thuật quốc gia </w:t>
-      </w:r>
-      <w:r>
-        <w:rPr>
-          <w:rFonts w:ascii="Calibri" w:cs="Calibri" w:eastAsia="Calibri" w:hAnsi="Calibri"/>
-          <w:b w:val="false"/>
-          <w:bCs w:val="false"/>
-          <w:i w:val="false"/>
-          <w:iCs w:val="false"/>
-          <w:sz w:val="26"/>
-          <w:szCs w:val="26"/>
-          <w:highlight w:val="yellow"/>
-        </w:rPr>
-        <w:t xml:space="preserve">{{TEN_QUY_CHUAN}}</w:t>
-      </w:r>
-      <w:r>
-        <w:rPr>
-          <w:rFonts w:ascii="Calibri" w:cs="Calibri" w:eastAsia="Calibri" w:hAnsi="Calibri"/>
-          <w:b w:val="false"/>
-          <w:bCs w:val="false"/>
-          <w:i w:val="false"/>
-          <w:iCs w:val="false"/>
-          <w:sz w:val="26"/>
-          <w:szCs w:val="26"/>
-        </w:rPr>
-        <w:t xml:space="preserve"> về bảo đảm an ninh mạng theo cấp độ.</w:t>
-      </w:r>
-    </w:p>
-    <w:p>
-      <w:pPr>
-        <w:spacing w:after="120" w:before="0" w:line="276" w:lineRule="auto"/>
-        <w:ind w:firstLine="566"/>
-        <w:jc w:val="both"/>
-      </w:pPr>
-      <w:r>
-        <w:rPr>
-          <w:rFonts w:ascii="Calibri" w:cs="Calibri" w:eastAsia="Calibri" w:hAnsi="Calibri"/>
+          <w:rFonts w:ascii="Times New Roman" w:cs="Times New Roman" w:eastAsia="Times New Roman" w:hAnsi="Times New Roman"/>
           <w:b/>
           <w:bCs/>
           <w:i w:val="false"/>
@@ -882,30 +1040,30 @@
           <w:sz w:val="26"/>
           <w:szCs w:val="26"/>
         </w:rPr>
-        <w:t xml:space="preserve">Điều 2.</w:t>
-      </w:r>
-      <w:r>
-        <w:rPr>
-          <w:rFonts w:ascii="Calibri" w:cs="Calibri" w:eastAsia="Calibri" w:hAnsi="Calibri"/>
-          <w:b w:val="false"/>
-          <w:bCs w:val="false"/>
-          <w:i w:val="false"/>
-          <w:iCs w:val="false"/>
-          <w:sz w:val="26"/>
-          <w:szCs w:val="26"/>
-        </w:rPr>
-        <w:t xml:space="preserve"> Tổ chức thực hiện</w:t>
-      </w:r>
-    </w:p>
-    <w:p>
-      <w:pPr>
-        <w:spacing w:after="120" w:before="0" w:line="276" w:lineRule="auto"/>
-        <w:ind w:firstLine="566"/>
-        <w:jc w:val="both"/>
-      </w:pPr>
-      <w:r>
-        <w:rPr>
-          <w:rFonts w:ascii="Calibri" w:cs="Calibri" w:eastAsia="Calibri" w:hAnsi="Calibri"/>
+        <w:t xml:space="preserve">Điều 3.</w:t>
+      </w:r>
+      <w:r>
+        <w:rPr>
+          <w:rFonts w:ascii="Times New Roman" w:cs="Times New Roman" w:eastAsia="Times New Roman" w:hAnsi="Times New Roman"/>
+          <w:b w:val="false"/>
+          <w:bCs w:val="false"/>
+          <w:i w:val="false"/>
+          <w:iCs w:val="false"/>
+          <w:sz w:val="26"/>
+          <w:szCs w:val="26"/>
+        </w:rPr>
+        <w:t xml:space="preserve"> Điều khoản thi hành</w:t>
+      </w:r>
+    </w:p>
+    <w:p>
+      <w:pPr>
+        <w:spacing w:after="60" w:before="0" w:line="276" w:lineRule="auto"/>
+        <w:ind w:left="453" w:hanging="283"/>
+        <w:jc w:val="both"/>
+      </w:pPr>
+      <w:r>
+        <w:rPr>
+          <w:rFonts w:ascii="Times New Roman" w:cs="Times New Roman" w:eastAsia="Times New Roman" w:hAnsi="Times New Roman"/>
           <w:b w:val="false"/>
           <w:bCs w:val="false"/>
           <w:i w:val="false"/>
@@ -917,178 +1075,20 @@
       </w:r>
       <w:r>
         <w:rPr>
-          <w:rFonts w:ascii="Calibri" w:cs="Calibri" w:eastAsia="Calibri" w:hAnsi="Calibri"/>
-          <w:b w:val="false"/>
-          <w:bCs w:val="false"/>
-          <w:i w:val="false"/>
-          <w:iCs w:val="false"/>
-          <w:sz w:val="26"/>
-          <w:szCs w:val="26"/>
-          <w:highlight w:val="yellow"/>
-        </w:rPr>
-        <w:t xml:space="preserve">{{TEN_DON_VI_DE_NGHI}}</w:t>
-      </w:r>
-      <w:r>
-        <w:rPr>
-          <w:rFonts w:ascii="Calibri" w:cs="Calibri" w:eastAsia="Calibri" w:hAnsi="Calibri"/>
-          <w:b w:val="false"/>
-          <w:bCs w:val="false"/>
-          <w:i w:val="false"/>
-          <w:iCs w:val="false"/>
-          <w:sz w:val="26"/>
-          <w:szCs w:val="26"/>
-        </w:rPr>
-        <w:t xml:space="preserve"> chịu trách nhiệm:</w:t>
-      </w:r>
-    </w:p>
-    <w:p>
-      <w:pPr>
-        <w:spacing w:after="120" w:before="0" w:line="276" w:lineRule="auto"/>
-        <w:ind w:firstLine="850"/>
-        <w:jc w:val="both"/>
-      </w:pPr>
-      <w:r>
-        <w:rPr>
-          <w:rFonts w:ascii="Calibri" w:cs="Calibri" w:eastAsia="Calibri" w:hAnsi="Calibri"/>
-          <w:b w:val="false"/>
-          <w:bCs w:val="false"/>
-          <w:i w:val="false"/>
-          <w:iCs w:val="false"/>
-          <w:sz w:val="26"/>
-          <w:szCs w:val="26"/>
-        </w:rPr>
-        <w:t xml:space="preserve">a) Thực hiện trách nhiệm bảo đảm an ninh mạng hệ thống thông tin mình quản lý theo các quy định tại Điều 33 Nghị định này.</w:t>
-      </w:r>
-    </w:p>
-    <w:p>
-      <w:pPr>
-        <w:spacing w:after="120" w:before="0" w:line="276" w:lineRule="auto"/>
-        <w:ind w:firstLine="850"/>
-        <w:jc w:val="both"/>
-      </w:pPr>
-      <w:r>
-        <w:rPr>
-          <w:rFonts w:ascii="Calibri" w:cs="Calibri" w:eastAsia="Calibri" w:hAnsi="Calibri"/>
-          <w:b w:val="false"/>
-          <w:bCs w:val="false"/>
-          <w:i w:val="false"/>
-          <w:iCs w:val="false"/>
-          <w:sz w:val="26"/>
-          <w:szCs w:val="26"/>
-        </w:rPr>
-        <w:t xml:space="preserve">b) Các nội dung khác (nếu có). </w:t>
-      </w:r>
-      <w:r>
-        <w:rPr>
-          <w:rFonts w:ascii="Calibri" w:cs="Calibri" w:eastAsia="Calibri" w:hAnsi="Calibri"/>
-          <w:b w:val="false"/>
-          <w:bCs w:val="false"/>
-          <w:i w:val="false"/>
-          <w:iCs w:val="false"/>
-          <w:sz w:val="26"/>
-          <w:szCs w:val="26"/>
-          <w:highlight w:val="yellow"/>
-        </w:rPr>
-        <w:t xml:space="preserve">{{NOI_DUNG_KHAC}}</w:t>
-      </w:r>
-    </w:p>
-    <w:p>
-      <w:pPr>
-        <w:spacing w:after="120" w:before="0" w:line="276" w:lineRule="auto"/>
-        <w:ind w:firstLine="566"/>
-        <w:jc w:val="both"/>
-      </w:pPr>
-      <w:r>
-        <w:rPr>
-          <w:rFonts w:ascii="Calibri" w:cs="Calibri" w:eastAsia="Calibri" w:hAnsi="Calibri"/>
-          <w:b w:val="false"/>
-          <w:bCs w:val="false"/>
-          <w:i w:val="false"/>
-          <w:iCs w:val="false"/>
-          <w:sz w:val="26"/>
-          <w:szCs w:val="26"/>
-        </w:rPr>
-        <w:t xml:space="preserve">2. Trách nhiệm của các cơ quan liên quan khác (nếu có). </w:t>
-      </w:r>
-      <w:r>
-        <w:rPr>
-          <w:rFonts w:ascii="Calibri" w:cs="Calibri" w:eastAsia="Calibri" w:hAnsi="Calibri"/>
-          <w:b w:val="false"/>
-          <w:bCs w:val="false"/>
-          <w:i w:val="false"/>
-          <w:iCs w:val="false"/>
-          <w:sz w:val="26"/>
-          <w:szCs w:val="26"/>
-          <w:highlight w:val="yellow"/>
-        </w:rPr>
-        <w:t xml:space="preserve">{{TRACH_NHIEM_CO_QUAN_KHAC}}</w:t>
-      </w:r>
-    </w:p>
-    <w:p>
-      <w:pPr>
-        <w:spacing w:after="120" w:before="0" w:line="276" w:lineRule="auto"/>
-        <w:ind w:firstLine="566"/>
-        <w:jc w:val="both"/>
-      </w:pPr>
-      <w:r>
-        <w:rPr>
-          <w:rFonts w:ascii="Calibri" w:cs="Calibri" w:eastAsia="Calibri" w:hAnsi="Calibri"/>
-          <w:b/>
-          <w:bCs/>
-          <w:i w:val="false"/>
-          <w:iCs w:val="false"/>
-          <w:sz w:val="26"/>
-          <w:szCs w:val="26"/>
-        </w:rPr>
-        <w:t xml:space="preserve">Điều 3.</w:t>
-      </w:r>
-      <w:r>
-        <w:rPr>
-          <w:rFonts w:ascii="Calibri" w:cs="Calibri" w:eastAsia="Calibri" w:hAnsi="Calibri"/>
-          <w:b w:val="false"/>
-          <w:bCs w:val="false"/>
-          <w:i w:val="false"/>
-          <w:iCs w:val="false"/>
-          <w:sz w:val="26"/>
-          <w:szCs w:val="26"/>
-        </w:rPr>
-        <w:t xml:space="preserve"> Điều khoản thi hành</w:t>
-      </w:r>
-    </w:p>
-    <w:p>
-      <w:pPr>
-        <w:spacing w:after="120" w:before="0" w:line="276" w:lineRule="auto"/>
-        <w:ind w:firstLine="566"/>
-        <w:jc w:val="both"/>
-      </w:pPr>
-      <w:r>
-        <w:rPr>
-          <w:rFonts w:ascii="Calibri" w:cs="Calibri" w:eastAsia="Calibri" w:hAnsi="Calibri"/>
-          <w:b w:val="false"/>
-          <w:bCs w:val="false"/>
-          <w:i w:val="false"/>
-          <w:iCs w:val="false"/>
-          <w:sz w:val="26"/>
-          <w:szCs w:val="26"/>
-        </w:rPr>
-        <w:t xml:space="preserve">1. Cơ quan </w:t>
-      </w:r>
-      <w:r>
-        <w:rPr>
-          <w:rFonts w:ascii="Calibri" w:cs="Calibri" w:eastAsia="Calibri" w:hAnsi="Calibri"/>
-          <w:b w:val="false"/>
-          <w:bCs w:val="false"/>
-          <w:i w:val="false"/>
-          <w:iCs w:val="false"/>
-          <w:sz w:val="26"/>
-          <w:szCs w:val="26"/>
-          <w:highlight w:val="yellow"/>
-        </w:rPr>
-        <w:t xml:space="preserve">{{TEN_DON_VI_DE_XUAT}}</w:t>
-      </w:r>
-      <w:r>
-        <w:rPr>
-          <w:rFonts w:ascii="Calibri" w:cs="Calibri" w:eastAsia="Calibri" w:hAnsi="Calibri"/>
+          <w:rFonts w:ascii="Times New Roman" w:cs="Times New Roman" w:eastAsia="Times New Roman" w:hAnsi="Times New Roman"/>
+          <w:b w:val="false"/>
+          <w:bCs w:val="false"/>
+          <w:i w:val="false"/>
+          <w:iCs w:val="false"/>
+          <w:sz w:val="26"/>
+          <w:szCs w:val="26"/>
+          <w:highlight w:val="yellow"/>
+        </w:rPr>
+        <w:t xml:space="preserve">Phòng Vận hành hệ thống</w:t>
+      </w:r>
+      <w:r>
+        <w:rPr>
+          <w:rFonts w:ascii="Times New Roman" w:cs="Times New Roman" w:eastAsia="Times New Roman" w:hAnsi="Times New Roman"/>
           <w:b w:val="false"/>
           <w:bCs w:val="false"/>
           <w:i w:val="false"/>
@@ -1101,13 +1101,13 @@
     </w:p>
     <w:p>
       <w:pPr>
-        <w:spacing w:after="120" w:before="0" w:line="276" w:lineRule="auto"/>
-        <w:ind w:firstLine="566"/>
-        <w:jc w:val="both"/>
-      </w:pPr>
-      <w:r>
-        <w:rPr>
-          <w:rFonts w:ascii="Calibri" w:cs="Calibri" w:eastAsia="Calibri" w:hAnsi="Calibri"/>
+        <w:spacing w:after="60" w:before="0" w:line="276" w:lineRule="auto"/>
+        <w:ind w:left="453" w:hanging="283"/>
+        <w:jc w:val="both"/>
+      </w:pPr>
+      <w:r>
+        <w:rPr>
+          <w:rFonts w:ascii="Times New Roman" w:cs="Times New Roman" w:eastAsia="Times New Roman" w:hAnsi="Times New Roman"/>
           <w:b w:val="false"/>
           <w:bCs w:val="false"/>
           <w:i w:val="false"/>
@@ -1119,20 +1119,20 @@
       </w:r>
       <w:r>
         <w:rPr>
-          <w:rFonts w:ascii="Calibri" w:cs="Calibri" w:eastAsia="Calibri" w:hAnsi="Calibri"/>
-          <w:b w:val="false"/>
-          <w:bCs w:val="false"/>
-          <w:i w:val="false"/>
-          <w:iCs w:val="false"/>
-          <w:sz w:val="26"/>
-          <w:szCs w:val="26"/>
-          <w:highlight w:val="yellow"/>
-        </w:rPr>
-        <w:t xml:space="preserve">{{TEN_CHU_QUAN_HTTT}}</w:t>
-      </w:r>
-      <w:r>
-        <w:rPr>
-          <w:rFonts w:ascii="Calibri" w:cs="Calibri" w:eastAsia="Calibri" w:hAnsi="Calibri"/>
+          <w:rFonts w:ascii="Times New Roman" w:cs="Times New Roman" w:eastAsia="Times New Roman" w:hAnsi="Times New Roman"/>
+          <w:b w:val="false"/>
+          <w:bCs w:val="false"/>
+          <w:i w:val="false"/>
+          <w:iCs w:val="false"/>
+          <w:sz w:val="26"/>
+          <w:szCs w:val="26"/>
+          <w:highlight w:val="yellow"/>
+        </w:rPr>
+        <w:t xml:space="preserve">Công ty cổ phần Giải pháp Công nghệ TURBO</w:t>
+      </w:r>
+      <w:r>
+        <w:rPr>
+          <w:rFonts w:ascii="Times New Roman" w:cs="Times New Roman" w:eastAsia="Times New Roman" w:hAnsi="Times New Roman"/>
           <w:b w:val="false"/>
           <w:bCs w:val="false"/>
           <w:i w:val="false"/>
@@ -1151,7 +1151,7 @@
     </w:p>
     <w:tbl>
       <w:tblPr>
-        <w:tblW w:type="dxa" w:w="9354"/>
+        <w:tblW w:type="dxa" w:w="9025"/>
         <w:tblBorders>
           <w:top w:val="none" w:color="FFFFFF" w:sz="0"/>
           <w:left w:val="none" w:color="FFFFFF" w:sz="0"/>
@@ -1163,13 +1163,13 @@
         <w:tblLayout w:type="fixed"/>
       </w:tblPr>
       <w:tblGrid>
-        <w:gridCol w:w="4209"/>
-        <w:gridCol w:w="5145"/>
+        <w:gridCol w:w="4061"/>
+        <w:gridCol w:w="4964"/>
       </w:tblGrid>
       <w:tr>
         <w:tc>
           <w:tcPr>
-            <w:tcW w:type="dxa" w:w="4209"/>
+            <w:tcW w:type="dxa" w:w="4061"/>
             <w:tcBorders>
               <w:top w:val="none" w:color="FFFFFF" w:sz="0"/>
               <w:left w:val="none" w:color="FFFFFF" w:sz="0"/>
@@ -1184,7 +1184,7 @@
             </w:pPr>
             <w:r>
               <w:rPr>
-                <w:rFonts w:ascii="Calibri" w:cs="Calibri" w:eastAsia="Calibri" w:hAnsi="Calibri"/>
+                <w:rFonts w:ascii="Times New Roman" w:cs="Times New Roman" w:eastAsia="Times New Roman" w:hAnsi="Times New Roman"/>
                 <w:b/>
                 <w:bCs/>
                 <w:i w:val="false"/>
@@ -1202,7 +1202,7 @@
             </w:pPr>
             <w:r>
               <w:rPr>
-                <w:rFonts w:ascii="Calibri" w:cs="Calibri" w:eastAsia="Calibri" w:hAnsi="Calibri"/>
+                <w:rFonts w:ascii="Times New Roman" w:cs="Times New Roman" w:eastAsia="Times New Roman" w:hAnsi="Times New Roman"/>
                 <w:b w:val="false"/>
                 <w:bCs w:val="false"/>
                 <w:i w:val="false"/>
@@ -1220,7 +1220,7 @@
             </w:pPr>
             <w:r>
               <w:rPr>
-                <w:rFonts w:ascii="Calibri" w:cs="Calibri" w:eastAsia="Calibri" w:hAnsi="Calibri"/>
+                <w:rFonts w:ascii="Times New Roman" w:cs="Times New Roman" w:eastAsia="Times New Roman" w:hAnsi="Times New Roman"/>
                 <w:b w:val="false"/>
                 <w:bCs w:val="false"/>
                 <w:i w:val="false"/>
@@ -1232,7 +1232,7 @@
             </w:r>
             <w:r>
               <w:rPr>
-                <w:rFonts w:ascii="Calibri" w:cs="Calibri" w:eastAsia="Calibri" w:hAnsi="Calibri"/>
+                <w:rFonts w:ascii="Times New Roman" w:cs="Times New Roman" w:eastAsia="Times New Roman" w:hAnsi="Times New Roman"/>
                 <w:b w:val="false"/>
                 <w:bCs w:val="false"/>
                 <w:i w:val="false"/>
@@ -1241,13 +1241,13 @@
                 <w:szCs w:val="22"/>
                 <w:highlight w:val="yellow"/>
               </w:rPr>
-              <w:t xml:space="preserve">{{NOI_NHAN_KHAC}}</w:t>
+              <w:t xml:space="preserve">Lưu: VT, PVH.</w:t>
             </w:r>
           </w:p>
         </w:tc>
         <w:tc>
           <w:tcPr>
-            <w:tcW w:type="dxa" w:w="5145"/>
+            <w:tcW w:type="dxa" w:w="4964"/>
             <w:tcBorders>
               <w:top w:val="none" w:color="FFFFFF" w:sz="0"/>
               <w:left w:val="none" w:color="FFFFFF" w:sz="0"/>
@@ -1262,9 +1262,9 @@
             </w:pPr>
             <w:r>
               <w:rPr>
-                <w:rFonts w:ascii="Calibri" w:cs="Calibri" w:eastAsia="Calibri" w:hAnsi="Calibri"/>
-                <w:b/>
-                <w:bCs/>
+                <w:rFonts w:ascii="Times New Roman" w:cs="Times New Roman" w:eastAsia="Times New Roman" w:hAnsi="Times New Roman"/>
+                <w:b w:val="false"/>
+                <w:bCs w:val="false"/>
                 <w:i w:val="false"/>
                 <w:iCs w:val="false"/>
                 <w:sz w:val="26"/>
@@ -1280,7 +1280,7 @@
             </w:pPr>
             <w:r>
               <w:rPr>
-                <w:rFonts w:ascii="Calibri" w:cs="Calibri" w:eastAsia="Calibri" w:hAnsi="Calibri"/>
+                <w:rFonts w:ascii="Times New Roman" w:cs="Times New Roman" w:eastAsia="Times New Roman" w:hAnsi="Times New Roman"/>
                 <w:b w:val="false"/>
                 <w:bCs w:val="false"/>
                 <w:i/>
@@ -1298,7 +1298,7 @@
             </w:pPr>
             <w:r>
               <w:rPr>
-                <w:rFonts w:ascii="Calibri" w:cs="Calibri" w:eastAsia="Calibri" w:hAnsi="Calibri"/>
+                <w:rFonts w:ascii="Times New Roman" w:cs="Times New Roman" w:eastAsia="Times New Roman" w:hAnsi="Times New Roman"/>
                 <w:b w:val="false"/>
                 <w:bCs w:val="false"/>
                 <w:i w:val="false"/>
@@ -1316,7 +1316,7 @@
             </w:pPr>
             <w:r>
               <w:rPr>
-                <w:rFonts w:ascii="Calibri" w:cs="Calibri" w:eastAsia="Calibri" w:hAnsi="Calibri"/>
+                <w:rFonts w:ascii="Times New Roman" w:cs="Times New Roman" w:eastAsia="Times New Roman" w:hAnsi="Times New Roman"/>
                 <w:b w:val="false"/>
                 <w:bCs w:val="false"/>
                 <w:i w:val="false"/>
@@ -1334,7 +1334,7 @@
             </w:pPr>
             <w:r>
               <w:rPr>
-                <w:rFonts w:ascii="Calibri" w:cs="Calibri" w:eastAsia="Calibri" w:hAnsi="Calibri"/>
+                <w:rFonts w:ascii="Times New Roman" w:cs="Times New Roman" w:eastAsia="Times New Roman" w:hAnsi="Times New Roman"/>
                 <w:b/>
                 <w:bCs/>
                 <w:i w:val="false"/>
@@ -1343,7 +1343,7 @@
                 <w:szCs w:val="26"/>
                 <w:highlight w:val="yellow"/>
               </w:rPr>
-              <w:t xml:space="preserve">{{HO_TEN_NGUOI_KY}}</w:t>
+              <w:t xml:space="preserve">Nguyễn Văn An</w:t>
             </w:r>
           </w:p>
           <w:p>
@@ -1353,7 +1353,7 @@
             </w:pPr>
             <w:r>
               <w:rPr>
-                <w:rFonts w:ascii="Calibri" w:cs="Calibri" w:eastAsia="Calibri" w:hAnsi="Calibri"/>
+                <w:rFonts w:ascii="Times New Roman" w:cs="Times New Roman" w:eastAsia="Times New Roman" w:hAnsi="Times New Roman"/>
                 <w:b w:val="false"/>
                 <w:bCs w:val="false"/>
                 <w:i w:val="false"/>
@@ -1362,7 +1362,7 @@
                 <w:szCs w:val="26"/>
                 <w:highlight w:val="yellow"/>
               </w:rPr>
-              <w:t xml:space="preserve">{{CHUC_DANH}}</w:t>
+              <w:t xml:space="preserve">Tổng Giám đốc</w:t>
             </w:r>
           </w:p>
         </w:tc>
@@ -1370,7 +1370,7 @@
     </w:tbl>
     <w:sectPr>
       <w:pgSz w:w="11905" w:h="16837" w:orient="portrait"/>
-      <w:pgMar w:top="1133" w:right="850" w:bottom="1133" w:left="1700" w:header="708" w:footer="708" w:gutter="0"/>
+      <w:pgMar w:top="1440" w:right="1440" w:bottom="1440" w:left="1440" w:header="708" w:footer="708" w:gutter="0"/>
       <w:pgNumType/>
       <w:docGrid w:linePitch="360"/>
     </w:sectPr>
@@ -1556,7 +1556,7 @@
   <w:docDefaults>
     <w:rPrDefault>
       <w:rPr>
-        <w:rFonts w:ascii="Calibri" w:cs="Calibri" w:eastAsia="Calibri" w:hAnsi="Calibri"/>
+        <w:rFonts w:ascii="Times New Roman" w:cs="Times New Roman" w:eastAsia="Times New Roman" w:hAnsi="Times New Roman"/>
         <w:sz w:val="26"/>
         <w:szCs w:val="26"/>
       </w:rPr>

</xml_diff>